<commit_message>
Add Part B (interview & case prep) and consultant-panel cheat-sheet layer
Part B (~24pp) for the WEF GRIP Policy Lead role, calibrated to an ex-McKinsey
partner panel: how a consultant panel interviews and scores; a frameworks
primer (MECE, issue trees, hypothesis-driven, plus the role-specific
transformation frameworks); ten structured problem-solving cases with issue
trees and model walk-throughs; an 18-question expert Q&A bank; the Personal
Experience Interview drills across the 2025 four dimensions with story
scaffolds from the candidate's background; and a 100-day plan. Also adds a
consultant-panel block (PEI dimensions, communication habits, case drill) to
the cheat sheet.

Co-Authored-By: Claude Opus 4.8 <noreply@anthropic.com>
Claude-Session: https://claude.ai/code/session_01NDVXzFC44p5xn3JwqHG8XQ
</commit_message>
<xml_diff>
--- a/GRIP_Cheat_Sheet.docx
+++ b/GRIP_Cheat_Sheet.docx
@@ -1560,6 +1560,154 @@
           <w:sz w:val="22"/>
           <w:szCs w:val="22"/>
         </w:rPr>
+        <w:t xml:space="preserve">The consultant panel (they're ex-McKinsey)</w:t>
+      </w:r>
+    </w:p>
+    <w:p>
+      <w:pPr>
+        <w:pStyle w:val="ListParagraph"/>
+        <w:numPr>
+          <w:ilvl w:val="0"/>
+          <w:numId w:val="1"/>
+        </w:numPr>
+        <w:spacing w:after="70" w:line="268"/>
+      </w:pPr>
+      <w:r>
+        <w:rPr>
+          <w:rFonts w:ascii="Georgia" w:cs="Georgia" w:eastAsia="Georgia" w:hAnsi="Georgia"/>
+          <w:b/>
+          <w:bCs/>
+          <w:color w:val="1A1A1A"/>
+          <w:sz w:val="21"/>
+          <w:szCs w:val="21"/>
+        </w:rPr>
+        <w:t xml:space="preserve">Score = structure &gt; recall.</w:t>
+      </w:r>
+      <w:r>
+        <w:rPr>
+          <w:rFonts w:ascii="Georgia" w:cs="Georgia" w:eastAsia="Georgia" w:hAnsi="Georgia"/>
+          <w:color w:val="1A1A1A"/>
+          <w:sz w:val="21"/>
+          <w:szCs w:val="21"/>
+        </w:rPr>
+        <w:t xml:space="preserve"> They grade how you break down a messy question, prioritise (80/20), hypothesise, quantify, and communicate.</w:t>
+      </w:r>
+    </w:p>
+    <w:p>
+      <w:pPr>
+        <w:pStyle w:val="ListParagraph"/>
+        <w:numPr>
+          <w:ilvl w:val="0"/>
+          <w:numId w:val="1"/>
+        </w:numPr>
+        <w:spacing w:after="70" w:line="268"/>
+      </w:pPr>
+      <w:r>
+        <w:rPr>
+          <w:rFonts w:ascii="Georgia" w:cs="Georgia" w:eastAsia="Georgia" w:hAnsi="Georgia"/>
+          <w:b/>
+          <w:bCs/>
+          <w:color w:val="1A1A1A"/>
+          <w:sz w:val="21"/>
+          <w:szCs w:val="21"/>
+        </w:rPr>
+        <w:t xml:space="preserve">Communicate top-down:</w:t>
+      </w:r>
+      <w:r>
+        <w:rPr>
+          <w:rFonts w:ascii="Georgia" w:cs="Georgia" w:eastAsia="Georgia" w:hAnsi="Georgia"/>
+          <w:color w:val="1A1A1A"/>
+          <w:sz w:val="21"/>
+          <w:szCs w:val="21"/>
+        </w:rPr>
+        <w:t xml:space="preserve"> answer first (Pyramid Principle), signpost (“three things…”), synthesise not summarise, quantify directionally.</w:t>
+      </w:r>
+    </w:p>
+    <w:p>
+      <w:pPr>
+        <w:pStyle w:val="ListParagraph"/>
+        <w:numPr>
+          <w:ilvl w:val="0"/>
+          <w:numId w:val="1"/>
+        </w:numPr>
+        <w:spacing w:after="70" w:line="268"/>
+      </w:pPr>
+      <w:r>
+        <w:rPr>
+          <w:rFonts w:ascii="Georgia" w:cs="Georgia" w:eastAsia="Georgia" w:hAnsi="Georgia"/>
+          <w:b/>
+          <w:bCs/>
+          <w:color w:val="1A1A1A"/>
+          <w:sz w:val="21"/>
+          <w:szCs w:val="21"/>
+        </w:rPr>
+        <w:t xml:space="preserve">Case drill (6 steps):</w:t>
+      </w:r>
+      <w:r>
+        <w:rPr>
+          <w:rFonts w:ascii="Georgia" w:cs="Georgia" w:eastAsia="Georgia" w:hAnsi="Georgia"/>
+          <w:color w:val="1A1A1A"/>
+          <w:sz w:val="21"/>
+          <w:szCs w:val="21"/>
+        </w:rPr>
+        <w:t xml:space="preserve"> take a moment → structure (MECE, bespoke) → hypothesise → prioritise → work the branches → synthesise (recommendation + risk + next step). </w:t>
+      </w:r>
+      <w:r>
+        <w:rPr>
+          <w:rFonts w:ascii="Georgia" w:cs="Georgia" w:eastAsia="Georgia" w:hAnsi="Georgia"/>
+          <w:b/>
+          <w:bCs/>
+          <w:color w:val="1A1A1A"/>
+          <w:sz w:val="21"/>
+          <w:szCs w:val="21"/>
+        </w:rPr>
+        <w:t xml:space="preserve">Never framework-dump.</w:t>
+      </w:r>
+    </w:p>
+    <w:p>
+      <w:pPr>
+        <w:pStyle w:val="ListParagraph"/>
+        <w:numPr>
+          <w:ilvl w:val="0"/>
+          <w:numId w:val="1"/>
+        </w:numPr>
+        <w:spacing w:after="70" w:line="268"/>
+      </w:pPr>
+      <w:r>
+        <w:rPr>
+          <w:rFonts w:ascii="Georgia" w:cs="Georgia" w:eastAsia="Georgia" w:hAnsi="Georgia"/>
+          <w:b/>
+          <w:bCs/>
+          <w:color w:val="1A1A1A"/>
+          <w:sz w:val="21"/>
+          <w:szCs w:val="21"/>
+        </w:rPr>
+        <w:t xml:space="preserve">PEI (≈50% of interview), 4 dimensions (2025):</w:t>
+      </w:r>
+      <w:r>
+        <w:rPr>
+          <w:rFonts w:ascii="Georgia" w:cs="Georgia" w:eastAsia="Georgia" w:hAnsi="Georgia"/>
+          <w:color w:val="1A1A1A"/>
+          <w:sz w:val="21"/>
+          <w:szCs w:val="21"/>
+        </w:rPr>
+        <w:t xml:space="preserve"> Leadership (direction, mobilise), Connection (persuade/influence), Drive (initiative, build from scratch), Growth (resistance, learn from failure). 8 stories, 2 per dimension, SPAR, first-person “I”, granular detail (expect 10–25 probes).</w:t>
+      </w:r>
+    </w:p>
+    <w:p>
+      <w:pPr>
+        <w:pStyle w:val="Heading3"/>
+        <w:spacing w:after="70" w:before="160"/>
+      </w:pPr>
+      <w:r>
+        <w:rPr>
+          <w:rFonts w:ascii="Calibri" w:cs="Calibri" w:eastAsia="Calibri" w:hAnsi="Calibri"/>
+          <w:b/>
+          <w:bCs/>
+          <w:color w:val="1F2A44"/>
+          <w:sz w:val="22"/>
+          <w:szCs w:val="22"/>
+        </w:rPr>
         <w:t xml:space="preserve">Measuring impact (avoid vanity metrics)</w:t>
       </w:r>
     </w:p>

</xml_diff>